<commit_message>
Final: Complete Bluestock MF Capstone
</commit_message>
<xml_diff>
--- a/docs/Final_report.docx
+++ b/docs/Final_report.docx
@@ -1888,7 +1888,7 @@
         </w:rPr>
         <w:lastRenderedPageBreak/>
         <w:drawing>
-          <wp:inline distT="0" distB="0" distL="0" distR="0" wp14:anchorId="103CE97D" wp14:editId="1AD1C7A5">
+          <wp:inline distT="0" distB="0" distL="0" distR="0" wp14:anchorId="103CE97D" wp14:editId="3C8501E8">
             <wp:extent cx="5649686" cy="4370070"/>
             <wp:effectExtent l="0" t="0" r="8255" b="0"/>
             <wp:docPr id="113938278" name="Picture 5"/>
@@ -1993,10 +1993,61 @@
     </w:p>
     <w:p>
       <w:pPr>
+        <w:spacing w:before="100" w:after="160"/>
+      </w:pPr>
+      <w:r>
+        <w:rPr>
+          <w:noProof/>
+        </w:rPr>
+        <w:lastRenderedPageBreak/>
+        <w:drawing>
+          <wp:inline distT="0" distB="0" distL="0" distR="0" wp14:anchorId="3EDDB571" wp14:editId="75A7AC2C">
+            <wp:extent cx="5943600" cy="1870710"/>
+            <wp:effectExtent l="0" t="0" r="0" b="0"/>
+            <wp:docPr id="852627213" name="Picture 1"/>
+            <wp:cNvGraphicFramePr>
+              <a:graphicFrameLocks xmlns:a="http://schemas.openxmlformats.org/drawingml/2006/main" noChangeAspect="1"/>
+            </wp:cNvGraphicFramePr>
+            <a:graphic xmlns:a="http://schemas.openxmlformats.org/drawingml/2006/main">
+              <a:graphicData uri="http://schemas.openxmlformats.org/drawingml/2006/picture">
+                <pic:pic xmlns:pic="http://schemas.openxmlformats.org/drawingml/2006/picture">
+                  <pic:nvPicPr>
+                    <pic:cNvPr id="852627213" name="Picture 852627213"/>
+                    <pic:cNvPicPr/>
+                  </pic:nvPicPr>
+                  <pic:blipFill>
+                    <a:blip r:embed="rId22" cstate="print">
+                      <a:extLst>
+                        <a:ext uri="{28A0092B-C50C-407E-A947-70E740481C1C}">
+                          <a14:useLocalDpi xmlns:a14="http://schemas.microsoft.com/office/drawing/2010/main" val="0"/>
+                        </a:ext>
+                      </a:extLst>
+                    </a:blip>
+                    <a:stretch>
+                      <a:fillRect/>
+                    </a:stretch>
+                  </pic:blipFill>
+                  <pic:spPr>
+                    <a:xfrm>
+                      <a:off x="0" y="0"/>
+                      <a:ext cx="5943600" cy="1870710"/>
+                    </a:xfrm>
+                    <a:prstGeom prst="rect">
+                      <a:avLst/>
+                    </a:prstGeom>
+                  </pic:spPr>
+                </pic:pic>
+              </a:graphicData>
+            </a:graphic>
+          </wp:inline>
+        </w:drawing>
+      </w:r>
+    </w:p>
+    <w:p>
+      <w:pPr>
         <w:pStyle w:val="Heading1"/>
       </w:pPr>
       <w:r>
-        <w:lastRenderedPageBreak/>
         <w:t>Key Findings</w:t>
       </w:r>
     </w:p>
@@ -2176,9 +2227,20 @@
     </w:p>
     <w:p>
       <w:pPr>
+        <w:spacing w:before="100"/>
+      </w:pPr>
+    </w:p>
+    <w:p>
+      <w:pPr>
+        <w:spacing w:before="100"/>
+      </w:pPr>
+    </w:p>
+    <w:p>
+      <w:pPr>
         <w:pStyle w:val="Heading1"/>
       </w:pPr>
       <w:r>
+        <w:lastRenderedPageBreak/>
         <w:t>Limitations</w:t>
       </w:r>
     </w:p>
@@ -2219,7 +2281,6 @@
         <w:pStyle w:val="Heading1"/>
       </w:pPr>
       <w:r>
-        <w:lastRenderedPageBreak/>
         <w:t>Conclusion</w:t>
       </w:r>
     </w:p>

</xml_diff>